<commit_message>
Update IT doc for Inc 1
</commit_message>
<xml_diff>
--- a/Implementation&Testing.docx
+++ b/Implementation&Testing.docx
@@ -9,7 +9,7 @@
           <w:rFonts w:ascii="Arial" w:hAnsi="Arial" w:cs="Arial"/>
           <w:b/>
           <w:sz w:val="44"/>
-          <w:bdr w:val="none" w:sz="0" w:space="0" w:color="auto" w:frame="1"/>
+          <w:bdr w:val="none" w:color="auto" w:sz="0" w:space="0" w:frame="1"/>
         </w:rPr>
       </w:pPr>
       <w:r>
@@ -17,7 +17,7 @@
           <w:rFonts w:ascii="Arial" w:hAnsi="Arial" w:cs="Arial"/>
           <w:b/>
           <w:sz w:val="44"/>
-          <w:bdr w:val="none" w:sz="0" w:space="0" w:color="auto" w:frame="1"/>
+          <w:bdr w:val="none" w:color="auto" w:sz="0" w:space="0" w:frame="1"/>
         </w:rPr>
         <w:t xml:space="preserve">Software </w:t>
       </w:r>
@@ -26,7 +26,7 @@
           <w:rFonts w:ascii="Arial" w:hAnsi="Arial" w:cs="Arial"/>
           <w:b/>
           <w:sz w:val="44"/>
-          <w:bdr w:val="none" w:sz="0" w:space="0" w:color="auto" w:frame="1"/>
+          <w:bdr w:val="none" w:color="auto" w:sz="0" w:space="0" w:frame="1"/>
         </w:rPr>
         <w:t>Implementation</w:t>
       </w:r>
@@ -35,7 +35,7 @@
           <w:rFonts w:ascii="Arial" w:hAnsi="Arial" w:cs="Arial"/>
           <w:b/>
           <w:sz w:val="44"/>
-          <w:bdr w:val="none" w:sz="0" w:space="0" w:color="auto" w:frame="1"/>
+          <w:bdr w:val="none" w:color="auto" w:sz="0" w:space="0" w:frame="1"/>
         </w:rPr>
         <w:t xml:space="preserve"> </w:t>
       </w:r>
@@ -44,7 +44,7 @@
           <w:rFonts w:ascii="Arial" w:hAnsi="Arial" w:cs="Arial"/>
           <w:b/>
           <w:sz w:val="44"/>
-          <w:bdr w:val="none" w:sz="0" w:space="0" w:color="auto" w:frame="1"/>
+          <w:bdr w:val="none" w:color="auto" w:sz="0" w:space="0" w:frame="1"/>
         </w:rPr>
         <w:t xml:space="preserve">and </w:t>
       </w:r>
@@ -53,7 +53,7 @@
           <w:rFonts w:ascii="Arial" w:hAnsi="Arial" w:cs="Arial"/>
           <w:b/>
           <w:sz w:val="44"/>
-          <w:bdr w:val="none" w:sz="0" w:space="0" w:color="auto" w:frame="1"/>
+          <w:bdr w:val="none" w:color="auto" w:sz="0" w:space="0" w:frame="1"/>
         </w:rPr>
         <w:t>Testing</w:t>
       </w:r>
@@ -62,7 +62,7 @@
           <w:rFonts w:ascii="Arial" w:hAnsi="Arial" w:cs="Arial"/>
           <w:b/>
           <w:sz w:val="44"/>
-          <w:bdr w:val="none" w:sz="0" w:space="0" w:color="auto" w:frame="1"/>
+          <w:bdr w:val="none" w:color="auto" w:sz="0" w:space="0" w:frame="1"/>
         </w:rPr>
         <w:t xml:space="preserve"> Document </w:t>
       </w:r>
@@ -74,7 +74,7 @@
           <w:rFonts w:ascii="Arial" w:hAnsi="Arial" w:cs="Arial"/>
           <w:b/>
           <w:sz w:val="44"/>
-          <w:bdr w:val="none" w:sz="0" w:space="0" w:color="auto" w:frame="1"/>
+          <w:bdr w:val="none" w:color="auto" w:sz="0" w:space="0" w:frame="1"/>
         </w:rPr>
       </w:pPr>
     </w:p>
@@ -85,7 +85,7 @@
           <w:rFonts w:ascii="Arial" w:hAnsi="Arial" w:cs="Arial"/>
           <w:b/>
           <w:sz w:val="44"/>
-          <w:bdr w:val="none" w:sz="0" w:space="0" w:color="auto" w:frame="1"/>
+          <w:bdr w:val="none" w:color="auto" w:sz="0" w:space="0" w:frame="1"/>
         </w:rPr>
       </w:pPr>
       <w:r>
@@ -93,7 +93,7 @@
           <w:rFonts w:ascii="Arial" w:hAnsi="Arial" w:cs="Arial"/>
           <w:b/>
           <w:sz w:val="44"/>
-          <w:bdr w:val="none" w:sz="0" w:space="0" w:color="auto" w:frame="1"/>
+          <w:bdr w:val="none" w:color="auto" w:sz="0" w:space="0" w:frame="1"/>
         </w:rPr>
         <w:t>For</w:t>
       </w:r>
@@ -105,7 +105,7 @@
           <w:rFonts w:ascii="Arial" w:hAnsi="Arial" w:cs="Arial"/>
           <w:b/>
           <w:sz w:val="44"/>
-          <w:bdr w:val="none" w:sz="0" w:space="0" w:color="auto" w:frame="1"/>
+          <w:bdr w:val="none" w:color="auto" w:sz="0" w:space="0" w:frame="1"/>
         </w:rPr>
       </w:pPr>
     </w:p>
@@ -116,7 +116,7 @@
           <w:rFonts w:ascii="Arial" w:hAnsi="Arial" w:cs="Arial"/>
           <w:b/>
           <w:sz w:val="44"/>
-          <w:bdr w:val="none" w:sz="0" w:space="0" w:color="auto" w:frame="1"/>
+          <w:bdr w:val="none" w:color="auto" w:sz="0" w:space="0" w:frame="1"/>
         </w:rPr>
       </w:pPr>
       <w:r>
@@ -124,7 +124,7 @@
           <w:rFonts w:ascii="Arial" w:hAnsi="Arial" w:cs="Arial"/>
           <w:b/>
           <w:sz w:val="44"/>
-          <w:bdr w:val="none" w:sz="0" w:space="0" w:color="auto" w:frame="1"/>
+          <w:bdr w:val="none" w:color="auto" w:sz="0" w:space="0" w:frame="1"/>
         </w:rPr>
         <w:t>Group</w:t>
       </w:r>
@@ -133,7 +133,7 @@
           <w:rFonts w:ascii="Arial" w:hAnsi="Arial" w:cs="Arial"/>
           <w:b/>
           <w:sz w:val="44"/>
-          <w:bdr w:val="none" w:sz="0" w:space="0" w:color="auto" w:frame="1"/>
+          <w:bdr w:val="none" w:color="auto" w:sz="0" w:space="0" w:frame="1"/>
         </w:rPr>
         <w:t xml:space="preserve"> &lt;</w:t>
       </w:r>
@@ -142,7 +142,7 @@
           <w:rFonts w:ascii="Arial" w:hAnsi="Arial" w:cs="Arial"/>
           <w:b/>
           <w:sz w:val="44"/>
-          <w:bdr w:val="none" w:sz="0" w:space="0" w:color="auto" w:frame="1"/>
+          <w:bdr w:val="none" w:color="auto" w:sz="0" w:space="0" w:frame="1"/>
         </w:rPr>
         <w:t>17</w:t>
       </w:r>
@@ -151,7 +151,7 @@
           <w:rFonts w:ascii="Arial" w:hAnsi="Arial" w:cs="Arial"/>
           <w:b/>
           <w:sz w:val="44"/>
-          <w:bdr w:val="none" w:sz="0" w:space="0" w:color="auto" w:frame="1"/>
+          <w:bdr w:val="none" w:color="auto" w:sz="0" w:space="0" w:frame="1"/>
         </w:rPr>
         <w:t>&gt;</w:t>
       </w:r>
@@ -163,7 +163,7 @@
           <w:rFonts w:ascii="Arial" w:hAnsi="Arial" w:cs="Arial"/>
           <w:b/>
           <w:sz w:val="44"/>
-          <w:bdr w:val="none" w:sz="0" w:space="0" w:color="auto" w:frame="1"/>
+          <w:bdr w:val="none" w:color="auto" w:sz="0" w:space="0" w:frame="1"/>
         </w:rPr>
       </w:pPr>
     </w:p>
@@ -174,7 +174,7 @@
           <w:rFonts w:ascii="Arial" w:hAnsi="Arial" w:cs="Arial"/>
           <w:b/>
           <w:sz w:val="44"/>
-          <w:bdr w:val="none" w:sz="0" w:space="0" w:color="auto" w:frame="1"/>
+          <w:bdr w:val="none" w:color="auto" w:sz="0" w:space="0" w:frame="1"/>
         </w:rPr>
       </w:pPr>
     </w:p>
@@ -185,7 +185,7 @@
           <w:rFonts w:ascii="Arial" w:hAnsi="Arial" w:cs="Arial"/>
           <w:b/>
           <w:sz w:val="44"/>
-          <w:bdr w:val="none" w:sz="0" w:space="0" w:color="auto" w:frame="1"/>
+          <w:bdr w:val="none" w:color="auto" w:sz="0" w:space="0" w:frame="1"/>
         </w:rPr>
       </w:pPr>
     </w:p>
@@ -196,7 +196,7 @@
           <w:rFonts w:ascii="Arial" w:hAnsi="Arial" w:cs="Arial"/>
           <w:b/>
           <w:sz w:val="44"/>
-          <w:bdr w:val="none" w:sz="0" w:space="0" w:color="auto" w:frame="1"/>
+          <w:bdr w:val="none" w:color="auto" w:sz="0" w:space="0" w:frame="1"/>
         </w:rPr>
       </w:pPr>
     </w:p>
@@ -206,14 +206,14 @@
         <w:rPr>
           <w:rFonts w:ascii="Arial" w:hAnsi="Arial" w:cs="Arial"/>
           <w:sz w:val="28"/>
-          <w:bdr w:val="none" w:sz="0" w:space="0" w:color="auto" w:frame="1"/>
+          <w:bdr w:val="none" w:color="auto" w:sz="0" w:space="0" w:frame="1"/>
         </w:rPr>
       </w:pPr>
       <w:r>
         <w:rPr>
           <w:rFonts w:ascii="Arial" w:hAnsi="Arial" w:cs="Arial"/>
           <w:sz w:val="28"/>
-          <w:bdr w:val="none" w:sz="0" w:space="0" w:color="auto" w:frame="1"/>
+          <w:bdr w:val="none" w:color="auto" w:sz="0" w:space="0" w:frame="1"/>
         </w:rPr>
         <w:t>Version 1.0</w:t>
       </w:r>
@@ -224,7 +224,7 @@
         <w:rPr>
           <w:rFonts w:ascii="Arial" w:hAnsi="Arial" w:cs="Arial"/>
           <w:sz w:val="28"/>
-          <w:bdr w:val="none" w:sz="0" w:space="0" w:color="auto" w:frame="1"/>
+          <w:bdr w:val="none" w:color="auto" w:sz="0" w:space="0" w:frame="1"/>
         </w:rPr>
       </w:pPr>
     </w:p>
@@ -234,7 +234,7 @@
         <w:rPr>
           <w:rFonts w:ascii="Arial" w:hAnsi="Arial" w:cs="Arial"/>
           <w:sz w:val="28"/>
-          <w:bdr w:val="none" w:sz="0" w:space="0" w:color="auto" w:frame="1"/>
+          <w:bdr w:val="none" w:color="auto" w:sz="0" w:space="0" w:frame="1"/>
         </w:rPr>
       </w:pPr>
     </w:p>
@@ -244,7 +244,7 @@
         <w:rPr>
           <w:rFonts w:ascii="Arial" w:hAnsi="Arial" w:cs="Arial"/>
           <w:sz w:val="28"/>
-          <w:bdr w:val="none" w:sz="0" w:space="0" w:color="auto" w:frame="1"/>
+          <w:bdr w:val="none" w:color="auto" w:sz="0" w:space="0" w:frame="1"/>
         </w:rPr>
       </w:pPr>
     </w:p>
@@ -254,7 +254,7 @@
         <w:rPr>
           <w:rFonts w:ascii="Arial" w:hAnsi="Arial" w:cs="Arial"/>
           <w:sz w:val="28"/>
-          <w:bdr w:val="none" w:sz="0" w:space="0" w:color="auto" w:frame="1"/>
+          <w:bdr w:val="none" w:color="auto" w:sz="0" w:space="0" w:frame="1"/>
         </w:rPr>
       </w:pPr>
     </w:p>
@@ -264,7 +264,7 @@
         <w:rPr>
           <w:rFonts w:ascii="Arial" w:hAnsi="Arial" w:cs="Arial"/>
           <w:sz w:val="28"/>
-          <w:bdr w:val="none" w:sz="0" w:space="0" w:color="auto" w:frame="1"/>
+          <w:bdr w:val="none" w:color="auto" w:sz="0" w:space="0" w:frame="1"/>
         </w:rPr>
       </w:pPr>
     </w:p>
@@ -274,7 +274,7 @@
         <w:rPr>
           <w:rFonts w:ascii="Arial" w:hAnsi="Arial" w:cs="Arial"/>
           <w:sz w:val="28"/>
-          <w:bdr w:val="none" w:sz="0" w:space="0" w:color="auto" w:frame="1"/>
+          <w:bdr w:val="none" w:color="auto" w:sz="0" w:space="0" w:frame="1"/>
         </w:rPr>
       </w:pPr>
     </w:p>
@@ -284,7 +284,7 @@
         <w:rPr>
           <w:rFonts w:ascii="Arial" w:hAnsi="Arial" w:cs="Arial"/>
           <w:sz w:val="32"/>
-          <w:bdr w:val="none" w:sz="0" w:space="0" w:color="auto" w:frame="1"/>
+          <w:bdr w:val="none" w:color="auto" w:sz="0" w:space="0" w:frame="1"/>
         </w:rPr>
       </w:pPr>
       <w:r>
@@ -292,7 +292,7 @@
           <w:rFonts w:ascii="Arial" w:hAnsi="Arial" w:cs="Arial"/>
           <w:b/>
           <w:sz w:val="32"/>
-          <w:bdr w:val="none" w:sz="0" w:space="0" w:color="auto" w:frame="1"/>
+          <w:bdr w:val="none" w:color="auto" w:sz="0" w:space="0" w:frame="1"/>
         </w:rPr>
         <w:t>Authors</w:t>
       </w:r>
@@ -300,7 +300,7 @@
         <w:rPr>
           <w:rFonts w:ascii="Arial" w:hAnsi="Arial" w:cs="Arial"/>
           <w:sz w:val="32"/>
-          <w:bdr w:val="none" w:sz="0" w:space="0" w:color="auto" w:frame="1"/>
+          <w:bdr w:val="none" w:color="auto" w:sz="0" w:space="0" w:frame="1"/>
         </w:rPr>
         <w:t xml:space="preserve">: </w:t>
       </w:r>
@@ -311,14 +311,14 @@
         <w:rPr>
           <w:rFonts w:ascii="Arial" w:hAnsi="Arial" w:cs="Arial"/>
           <w:sz w:val="28"/>
-          <w:bdr w:val="none" w:sz="0" w:space="0" w:color="auto" w:frame="1"/>
+          <w:bdr w:val="none" w:color="auto" w:sz="0" w:space="0" w:frame="1"/>
         </w:rPr>
       </w:pPr>
       <w:r>
         <w:rPr>
           <w:rFonts w:ascii="Arial" w:hAnsi="Arial" w:cs="Arial"/>
           <w:sz w:val="28"/>
-          <w:bdr w:val="none" w:sz="0" w:space="0" w:color="auto" w:frame="1"/>
+          <w:bdr w:val="none" w:color="auto" w:sz="0" w:space="0" w:frame="1"/>
         </w:rPr>
         <w:t>Tyler K.</w:t>
       </w:r>
@@ -329,14 +329,14 @@
         <w:rPr>
           <w:rFonts w:ascii="Arial" w:hAnsi="Arial" w:cs="Arial"/>
           <w:sz w:val="28"/>
-          <w:bdr w:val="none" w:sz="0" w:space="0" w:color="auto" w:frame="1"/>
+          <w:bdr w:val="none" w:color="auto" w:sz="0" w:space="0" w:frame="1"/>
         </w:rPr>
       </w:pPr>
       <w:r>
         <w:rPr>
           <w:rFonts w:ascii="Arial" w:hAnsi="Arial" w:cs="Arial"/>
           <w:sz w:val="28"/>
-          <w:bdr w:val="none" w:sz="0" w:space="0" w:color="auto" w:frame="1"/>
+          <w:bdr w:val="none" w:color="auto" w:sz="0" w:space="0" w:frame="1"/>
         </w:rPr>
         <w:t>Angus L.</w:t>
       </w:r>
@@ -347,14 +347,14 @@
         <w:rPr>
           <w:rFonts w:ascii="Arial" w:hAnsi="Arial" w:cs="Arial"/>
           <w:sz w:val="28"/>
-          <w:bdr w:val="none" w:sz="0" w:space="0" w:color="auto" w:frame="1"/>
+          <w:bdr w:val="none" w:color="auto" w:sz="0" w:space="0" w:frame="1"/>
         </w:rPr>
       </w:pPr>
       <w:r>
         <w:rPr>
           <w:rFonts w:ascii="Arial" w:hAnsi="Arial" w:cs="Arial"/>
           <w:sz w:val="28"/>
-          <w:bdr w:val="none" w:sz="0" w:space="0" w:color="auto" w:frame="1"/>
+          <w:bdr w:val="none" w:color="auto" w:sz="0" w:space="0" w:frame="1"/>
         </w:rPr>
         <w:t>Cassadi Q.</w:t>
       </w:r>
@@ -365,14 +365,14 @@
         <w:rPr>
           <w:rFonts w:ascii="Arial" w:hAnsi="Arial" w:cs="Arial"/>
           <w:sz w:val="28"/>
-          <w:bdr w:val="none" w:sz="0" w:space="0" w:color="auto" w:frame="1"/>
+          <w:bdr w:val="none" w:color="auto" w:sz="0" w:space="0" w:frame="1"/>
         </w:rPr>
       </w:pPr>
       <w:r>
         <w:rPr>
           <w:rFonts w:ascii="Arial" w:hAnsi="Arial" w:cs="Arial"/>
           <w:sz w:val="28"/>
-          <w:bdr w:val="none" w:sz="0" w:space="0" w:color="auto" w:frame="1"/>
+          <w:bdr w:val="none" w:color="auto" w:sz="0" w:space="0" w:frame="1"/>
         </w:rPr>
         <w:t>Rachel A.</w:t>
       </w:r>
@@ -383,21 +383,21 @@
         <w:rPr>
           <w:rFonts w:ascii="Arial" w:hAnsi="Arial" w:cs="Arial"/>
           <w:sz w:val="28"/>
-          <w:bdr w:val="none" w:sz="0" w:space="0" w:color="auto" w:frame="1"/>
+          <w:bdr w:val="none" w:color="auto" w:sz="0" w:space="0" w:frame="1"/>
         </w:rPr>
       </w:pPr>
       <w:r>
         <w:rPr>
           <w:rFonts w:ascii="Arial" w:hAnsi="Arial" w:cs="Arial"/>
           <w:sz w:val="28"/>
-          <w:bdr w:val="none" w:sz="0" w:space="0" w:color="auto" w:frame="1"/>
+          <w:bdr w:val="none" w:color="auto" w:sz="0" w:space="0" w:frame="1"/>
         </w:rPr>
         <w:t>Rahil J.</w:t>
       </w:r>
       <w:r>
         <w:rPr>
           <w:sz w:val="36"/>
-          <w:bdr w:val="none" w:sz="0" w:space="0" w:color="auto" w:frame="1"/>
+          <w:bdr w:val="none" w:color="auto" w:sz="0" w:space="0" w:frame="1"/>
         </w:rPr>
         <w:br w:type="page"/>
       </w:r>
@@ -406,19 +406,19 @@
       <w:pPr>
         <w:pStyle w:val="Heading1"/>
         <w:rPr>
-          <w:rFonts w:ascii="inherit" w:hAnsi="inherit" w:cs="Lucida Grande" w:hint="eastAsia"/>
-        </w:rPr>
-      </w:pPr>
-      <w:r>
-        <w:rPr>
-          <w:bdr w:val="none" w:sz="0" w:space="0" w:color="auto" w:frame="1"/>
+          <w:rFonts w:hint="eastAsia" w:ascii="inherit" w:hAnsi="inherit" w:cs="Lucida Grande"/>
+        </w:rPr>
+      </w:pPr>
+      <w:r>
+        <w:rPr>
+          <w:bdr w:val="none" w:color="auto" w:sz="0" w:space="0" w:frame="1"/>
         </w:rPr>
         <w:lastRenderedPageBreak/>
         <w:t>Programming Languages</w:t>
       </w:r>
       <w:r>
         <w:rPr>
-          <w:bdr w:val="none" w:sz="0" w:space="0" w:color="auto" w:frame="1"/>
+          <w:bdr w:val="none" w:color="auto" w:sz="0" w:space="0" w:frame="1"/>
         </w:rPr>
         <w:t xml:space="preserve"> (5 points)</w:t>
       </w:r>
@@ -432,7 +432,7 @@
           <w:color w:val="000000"/>
           <w:sz w:val="20"/>
           <w:szCs w:val="20"/>
-          <w:bdr w:val="none" w:sz="0" w:space="0" w:color="auto" w:frame="1"/>
+          <w:bdr w:val="none" w:color="auto" w:sz="0" w:space="0" w:frame="1"/>
         </w:rPr>
       </w:pPr>
       <w:r>
@@ -442,451 +442,652 @@
           <w:color w:val="000000"/>
           <w:sz w:val="20"/>
           <w:szCs w:val="20"/>
-          <w:bdr w:val="none" w:sz="0" w:space="0" w:color="auto" w:frame="1"/>
+          <w:bdr w:val="none" w:color="auto" w:sz="0" w:space="0" w:frame="1"/>
         </w:rPr>
         <w:t>JavaScript – JavaScript has a library called React which allows us to create front-end components that look smooth extremely efficiently.</w:t>
       </w:r>
     </w:p>
     <w:p>
       <w:pPr>
-        <w:shd w:val="clear" w:color="auto" w:fill="FFFFFF"/>
-        <w:rPr>
-          <w:rFonts w:ascii="Arial" w:hAnsi="Arial" w:cs="Arial"/>
-          <w:iCs/>
+        <w:shd w:val="clear" w:color="auto" w:fill="FFFFFF" w:themeFill="background1"/>
+        <w:rPr>
+          <w:rFonts w:ascii="Arial" w:hAnsi="Arial" w:cs="Arial"/>
           <w:color w:val="000000"/>
           <w:sz w:val="20"/>
           <w:szCs w:val="20"/>
-          <w:bdr w:val="none" w:sz="0" w:space="0" w:color="auto" w:frame="1"/>
-        </w:rPr>
-      </w:pPr>
-      <w:r>
-        <w:rPr>
-          <w:rFonts w:ascii="Arial" w:hAnsi="Arial" w:cs="Arial"/>
-          <w:iCs/>
+          <w:bdr w:val="none" w:color="auto" w:sz="0" w:space="0" w:frame="1"/>
+        </w:rPr>
+      </w:pPr>
+      <w:r>
+        <w:rPr>
+          <w:rFonts w:ascii="Arial" w:hAnsi="Arial" w:cs="Arial"/>
           <w:color w:val="000000"/>
           <w:sz w:val="20"/>
           <w:szCs w:val="20"/>
-          <w:bdr w:val="none" w:sz="0" w:space="0" w:color="auto" w:frame="1"/>
-        </w:rPr>
-        <w:t>Python – Python has a library called Flask which is used to create the backend of the web application. The implementation removes a large part of the struggle with sockets and web directories. This was also the language used for the original version of the application making it trivial to switch from the legacy build.</w:t>
-      </w:r>
-    </w:p>
-    <w:p>
-      <w:pPr>
-        <w:pStyle w:val="Heading1"/>
-        <w:rPr>
-          <w:rFonts w:ascii="inherit" w:hAnsi="inherit" w:cs="Lucida Grande" w:hint="eastAsia"/>
-        </w:rPr>
-      </w:pPr>
-      <w:r>
-        <w:rPr>
-          <w:bdr w:val="none" w:sz="0" w:space="0" w:color="auto" w:frame="1"/>
-        </w:rPr>
-        <w:t>Platforms, APIs, Databases, and other technologies used</w:t>
-      </w:r>
-      <w:r>
-        <w:rPr>
-          <w:bdr w:val="none" w:sz="0" w:space="0" w:color="auto" w:frame="1"/>
-        </w:rPr>
-        <w:t xml:space="preserve"> (5 points) </w:t>
-      </w:r>
-    </w:p>
-    <w:p>
-      <w:pPr>
-        <w:shd w:val="clear" w:color="auto" w:fill="FFFFFF"/>
-        <w:rPr>
-          <w:rFonts w:ascii="Arial" w:hAnsi="Arial" w:cs="Arial"/>
-          <w:i/>
+          <w:bdr w:val="none" w:color="auto" w:sz="0" w:space="0" w:frame="1"/>
+        </w:rPr>
+        <w:t xml:space="preserve">Python – Python has a library called Flask which is used to create the backend of the web application. The implementation removes a large part of the struggle with sockets and web directories. This was also the language used for the original version of the </w:t>
+      </w:r>
+      <w:r>
+        <w:rPr>
+          <w:rFonts w:ascii="Arial" w:hAnsi="Arial" w:cs="Arial"/>
           <w:color w:val="000000"/>
           <w:sz w:val="20"/>
           <w:szCs w:val="20"/>
-          <w:bdr w:val="none" w:sz="0" w:space="0" w:color="auto" w:frame="1"/>
-        </w:rPr>
-      </w:pPr>
-      <w:r>
-        <w:rPr>
-          <w:rFonts w:ascii="Arial" w:hAnsi="Arial" w:cs="Arial"/>
-          <w:i/>
-          <w:color w:val="EE0000"/>
-          <w:sz w:val="20"/>
-          <w:szCs w:val="20"/>
-          <w:bdr w:val="none" w:sz="0" w:space="0" w:color="auto" w:frame="1"/>
-        </w:rPr>
-        <w:t>List all the platforms, APIs, Databases, and any other technologies you use in your project and where you use them (in what components of your project).</w:t>
-      </w:r>
-    </w:p>
-    <w:p>
-      <w:pPr>
-        <w:pStyle w:val="Heading1"/>
-        <w:rPr>
-          <w:rFonts w:ascii="inherit" w:hAnsi="inherit" w:cs="Lucida Grande" w:hint="eastAsia"/>
-        </w:rPr>
-      </w:pPr>
-      <w:r>
-        <w:rPr>
-          <w:bdr w:val="none" w:sz="0" w:space="0" w:color="auto" w:frame="1"/>
-        </w:rPr>
-        <w:t>Execution-based Functional Testing</w:t>
-      </w:r>
-      <w:r>
-        <w:rPr>
-          <w:bdr w:val="none" w:sz="0" w:space="0" w:color="auto" w:frame="1"/>
-        </w:rPr>
-        <w:t xml:space="preserve"> (10 points)</w:t>
-      </w:r>
-    </w:p>
-    <w:p>
-      <w:pPr>
-        <w:shd w:val="clear" w:color="auto" w:fill="FFFFFF"/>
-        <w:rPr>
-          <w:rFonts w:ascii="Arial" w:hAnsi="Arial" w:cs="Arial"/>
-          <w:i/>
-          <w:color w:val="EE0000"/>
-          <w:sz w:val="20"/>
-          <w:szCs w:val="20"/>
-          <w:bdr w:val="none" w:sz="0" w:space="0" w:color="auto" w:frame="1"/>
-        </w:rPr>
-      </w:pPr>
-      <w:r>
-        <w:rPr>
-          <w:rFonts w:ascii="Arial" w:hAnsi="Arial" w:cs="Arial"/>
-          <w:i/>
-          <w:color w:val="EE0000"/>
-          <w:sz w:val="20"/>
-          <w:szCs w:val="20"/>
-          <w:bdr w:val="none" w:sz="0" w:space="0" w:color="auto" w:frame="1"/>
-        </w:rPr>
-        <w:t>Describe how</w:t>
-      </w:r>
-      <w:r>
-        <w:rPr>
-          <w:rFonts w:ascii="Arial" w:hAnsi="Arial" w:cs="Arial"/>
-          <w:i/>
-          <w:color w:val="EE0000"/>
-          <w:sz w:val="20"/>
-          <w:szCs w:val="20"/>
-          <w:bdr w:val="none" w:sz="0" w:space="0" w:color="auto" w:frame="1"/>
-        </w:rPr>
-        <w:t>/if</w:t>
-      </w:r>
-      <w:r>
-        <w:rPr>
-          <w:rFonts w:ascii="Arial" w:hAnsi="Arial" w:cs="Arial"/>
-          <w:i/>
-          <w:color w:val="EE0000"/>
-          <w:sz w:val="20"/>
-          <w:szCs w:val="20"/>
-          <w:bdr w:val="none" w:sz="0" w:space="0" w:color="auto" w:frame="1"/>
-        </w:rPr>
-        <w:t xml:space="preserve"> you p</w:t>
-      </w:r>
-      <w:r>
-        <w:rPr>
-          <w:rFonts w:ascii="Arial" w:hAnsi="Arial" w:cs="Arial"/>
-          <w:i/>
-          <w:color w:val="EE0000"/>
-          <w:sz w:val="20"/>
-          <w:szCs w:val="20"/>
-          <w:bdr w:val="none" w:sz="0" w:space="0" w:color="auto" w:frame="1"/>
-        </w:rPr>
-        <w:t>er</w:t>
-      </w:r>
-      <w:r>
-        <w:rPr>
-          <w:rFonts w:ascii="Arial" w:hAnsi="Arial" w:cs="Arial"/>
-          <w:i/>
-          <w:color w:val="EE0000"/>
-          <w:sz w:val="20"/>
-          <w:szCs w:val="20"/>
-          <w:bdr w:val="none" w:sz="0" w:space="0" w:color="auto" w:frame="1"/>
-        </w:rPr>
-        <w:t xml:space="preserve">formed functional testing for your project (i.e., tested for the </w:t>
-      </w:r>
-      <w:r>
-        <w:rPr>
-          <w:rFonts w:ascii="Arial" w:hAnsi="Arial" w:cs="Arial"/>
-          <w:b/>
-          <w:bCs/>
-          <w:i/>
-          <w:color w:val="EE0000"/>
-          <w:sz w:val="20"/>
-          <w:szCs w:val="20"/>
-          <w:bdr w:val="none" w:sz="0" w:space="0" w:color="auto" w:frame="1"/>
-        </w:rPr>
-        <w:t>functional requirements</w:t>
-      </w:r>
-      <w:r>
-        <w:rPr>
-          <w:rFonts w:ascii="Arial" w:hAnsi="Arial" w:cs="Arial"/>
-          <w:i/>
-          <w:color w:val="EE0000"/>
-          <w:sz w:val="20"/>
-          <w:szCs w:val="20"/>
-          <w:bdr w:val="none" w:sz="0" w:space="0" w:color="auto" w:frame="1"/>
-        </w:rPr>
-        <w:t xml:space="preserve"> listed in your RD). </w:t>
-      </w:r>
-    </w:p>
-    <w:p>
-      <w:pPr>
-        <w:pStyle w:val="Heading1"/>
-        <w:rPr>
-          <w:rFonts w:ascii="inherit" w:hAnsi="inherit" w:cs="Lucida Grande" w:hint="eastAsia"/>
-        </w:rPr>
-      </w:pPr>
-      <w:r>
-        <w:rPr>
-          <w:bdr w:val="none" w:sz="0" w:space="0" w:color="auto" w:frame="1"/>
-        </w:rPr>
-        <w:t>Execution-based Non-Functional Testing</w:t>
-      </w:r>
-      <w:r>
-        <w:rPr>
-          <w:bdr w:val="none" w:sz="0" w:space="0" w:color="auto" w:frame="1"/>
-        </w:rPr>
-        <w:t xml:space="preserve"> (10 points)</w:t>
-      </w:r>
-    </w:p>
-    <w:p>
-      <w:pPr>
-        <w:shd w:val="clear" w:color="auto" w:fill="FFFFFF"/>
-        <w:rPr>
-          <w:rFonts w:ascii="Lucida Grande" w:hAnsi="Lucida Grande" w:cs="Lucida Grande"/>
-          <w:i/>
-          <w:color w:val="EE0000"/>
-        </w:rPr>
-      </w:pPr>
-      <w:r>
-        <w:rPr>
-          <w:rFonts w:ascii="Arial" w:hAnsi="Arial" w:cs="Arial"/>
-          <w:i/>
-          <w:color w:val="EE0000"/>
-          <w:sz w:val="20"/>
-          <w:szCs w:val="20"/>
-          <w:bdr w:val="none" w:sz="0" w:space="0" w:color="auto" w:frame="1"/>
-        </w:rPr>
-        <w:t>Describe how</w:t>
-      </w:r>
-      <w:r>
-        <w:rPr>
-          <w:rFonts w:ascii="Arial" w:hAnsi="Arial" w:cs="Arial"/>
-          <w:i/>
-          <w:color w:val="EE0000"/>
-          <w:sz w:val="20"/>
-          <w:szCs w:val="20"/>
-          <w:bdr w:val="none" w:sz="0" w:space="0" w:color="auto" w:frame="1"/>
-        </w:rPr>
-        <w:t>/if</w:t>
-      </w:r>
-      <w:r>
-        <w:rPr>
-          <w:rFonts w:ascii="Arial" w:hAnsi="Arial" w:cs="Arial"/>
-          <w:i/>
-          <w:color w:val="EE0000"/>
-          <w:sz w:val="20"/>
-          <w:szCs w:val="20"/>
-          <w:bdr w:val="none" w:sz="0" w:space="0" w:color="auto" w:frame="1"/>
-        </w:rPr>
-        <w:t xml:space="preserve"> you p</w:t>
-      </w:r>
-      <w:r>
-        <w:rPr>
-          <w:rFonts w:ascii="Arial" w:hAnsi="Arial" w:cs="Arial"/>
-          <w:i/>
-          <w:color w:val="EE0000"/>
-          <w:sz w:val="20"/>
-          <w:szCs w:val="20"/>
-          <w:bdr w:val="none" w:sz="0" w:space="0" w:color="auto" w:frame="1"/>
-        </w:rPr>
-        <w:t>er</w:t>
-      </w:r>
-      <w:r>
-        <w:rPr>
-          <w:rFonts w:ascii="Arial" w:hAnsi="Arial" w:cs="Arial"/>
-          <w:i/>
-          <w:color w:val="EE0000"/>
-          <w:sz w:val="20"/>
-          <w:szCs w:val="20"/>
-          <w:bdr w:val="none" w:sz="0" w:space="0" w:color="auto" w:frame="1"/>
-        </w:rPr>
-        <w:t xml:space="preserve">formed non-functional testing for your project (i.e., tested for the </w:t>
-      </w:r>
-      <w:r>
-        <w:rPr>
-          <w:rFonts w:ascii="Arial" w:hAnsi="Arial" w:cs="Arial"/>
-          <w:b/>
-          <w:bCs/>
-          <w:i/>
-          <w:color w:val="EE0000"/>
-          <w:sz w:val="20"/>
-          <w:szCs w:val="20"/>
-          <w:bdr w:val="none" w:sz="0" w:space="0" w:color="auto" w:frame="1"/>
-        </w:rPr>
-        <w:t>non-functional requirements</w:t>
-      </w:r>
-      <w:r>
-        <w:rPr>
-          <w:rFonts w:ascii="Arial" w:hAnsi="Arial" w:cs="Arial"/>
-          <w:i/>
-          <w:color w:val="EE0000"/>
-          <w:sz w:val="20"/>
-          <w:szCs w:val="20"/>
-          <w:bdr w:val="none" w:sz="0" w:space="0" w:color="auto" w:frame="1"/>
-        </w:rPr>
-        <w:t xml:space="preserve"> listed in your</w:t>
-      </w:r>
-      <w:r>
-        <w:rPr>
-          <w:rFonts w:ascii="Arial" w:hAnsi="Arial" w:cs="Arial"/>
-          <w:i/>
-          <w:color w:val="EE0000"/>
-          <w:sz w:val="20"/>
-          <w:szCs w:val="20"/>
-          <w:bdr w:val="none" w:sz="0" w:space="0" w:color="auto" w:frame="1"/>
-        </w:rPr>
-        <w:t xml:space="preserve"> </w:t>
-      </w:r>
-      <w:r>
-        <w:rPr>
-          <w:rFonts w:ascii="Arial" w:hAnsi="Arial" w:cs="Arial"/>
-          <w:i/>
-          <w:color w:val="EE0000"/>
-          <w:sz w:val="20"/>
-          <w:szCs w:val="20"/>
-          <w:bdr w:val="none" w:sz="0" w:space="0" w:color="auto" w:frame="1"/>
-        </w:rPr>
-        <w:t xml:space="preserve">RD). </w:t>
-      </w:r>
-    </w:p>
-    <w:p>
-      <w:pPr>
-        <w:pStyle w:val="Heading1"/>
-        <w:rPr>
-          <w:rFonts w:ascii="inherit" w:hAnsi="inherit" w:cs="Lucida Grande" w:hint="eastAsia"/>
-        </w:rPr>
-      </w:pPr>
-      <w:r>
-        <w:rPr>
-          <w:bdr w:val="none" w:sz="0" w:space="0" w:color="auto" w:frame="1"/>
-        </w:rPr>
-        <w:t xml:space="preserve">Non-Execution-based </w:t>
-      </w:r>
-      <w:r>
-        <w:rPr>
-          <w:bdr w:val="none" w:sz="0" w:space="0" w:color="auto" w:frame="1"/>
-        </w:rPr>
-        <w:t>T</w:t>
-      </w:r>
-      <w:r>
-        <w:rPr>
-          <w:bdr w:val="none" w:sz="0" w:space="0" w:color="auto" w:frame="1"/>
-        </w:rPr>
-        <w:t>esting</w:t>
-      </w:r>
-      <w:r>
-        <w:rPr>
-          <w:bdr w:val="none" w:sz="0" w:space="0" w:color="auto" w:frame="1"/>
-        </w:rPr>
-        <w:t> </w:t>
-      </w:r>
-      <w:r>
-        <w:rPr>
-          <w:bdr w:val="none" w:sz="0" w:space="0" w:color="auto" w:frame="1"/>
-        </w:rPr>
-        <w:t>(</w:t>
-      </w:r>
-      <w:r>
-        <w:rPr>
-          <w:bdr w:val="none" w:sz="0" w:space="0" w:color="auto" w:frame="1"/>
-        </w:rPr>
-        <w:t>10</w:t>
-      </w:r>
-      <w:r>
-        <w:rPr>
-          <w:bdr w:val="none" w:sz="0" w:space="0" w:color="auto" w:frame="1"/>
-        </w:rPr>
-        <w:t xml:space="preserve"> points)</w:t>
-      </w:r>
-    </w:p>
-    <w:p>
-      <w:pPr>
-        <w:shd w:val="clear" w:color="auto" w:fill="FFFFFF"/>
-        <w:rPr>
-          <w:rFonts w:ascii="Lucida Grande" w:hAnsi="Lucida Grande" w:cs="Lucida Grande"/>
-          <w:i/>
-          <w:color w:val="EE0000"/>
-        </w:rPr>
-      </w:pPr>
-      <w:r>
-        <w:rPr>
-          <w:rFonts w:ascii="Arial" w:hAnsi="Arial" w:cs="Arial"/>
-          <w:i/>
-          <w:color w:val="EE0000"/>
-          <w:sz w:val="20"/>
-          <w:szCs w:val="20"/>
-          <w:bdr w:val="none" w:sz="0" w:space="0" w:color="auto" w:frame="1"/>
-        </w:rPr>
-        <w:t>Describe how/if you p</w:t>
-      </w:r>
-      <w:r>
-        <w:rPr>
-          <w:rFonts w:ascii="Arial" w:hAnsi="Arial" w:cs="Arial"/>
-          <w:i/>
-          <w:color w:val="EE0000"/>
-          <w:sz w:val="20"/>
-          <w:szCs w:val="20"/>
-          <w:bdr w:val="none" w:sz="0" w:space="0" w:color="auto" w:frame="1"/>
-        </w:rPr>
-        <w:t>er</w:t>
-      </w:r>
-      <w:r>
-        <w:rPr>
-          <w:rFonts w:ascii="Arial" w:hAnsi="Arial" w:cs="Arial"/>
-          <w:i/>
-          <w:color w:val="EE0000"/>
-          <w:sz w:val="20"/>
-          <w:szCs w:val="20"/>
-          <w:bdr w:val="none" w:sz="0" w:space="0" w:color="auto" w:frame="1"/>
-        </w:rPr>
-        <w:t>formed non-execution-based testing (such as code reviews/inspections/wa</w:t>
-      </w:r>
-      <w:r>
-        <w:rPr>
-          <w:rFonts w:ascii="Arial" w:hAnsi="Arial" w:cs="Arial"/>
-          <w:i/>
-          <w:color w:val="EE0000"/>
-          <w:sz w:val="20"/>
-          <w:szCs w:val="20"/>
-          <w:bdr w:val="none" w:sz="0" w:space="0" w:color="auto" w:frame="1"/>
-        </w:rPr>
-        <w:t>l</w:t>
-      </w:r>
-      <w:r>
-        <w:rPr>
-          <w:rFonts w:ascii="Arial" w:hAnsi="Arial" w:cs="Arial"/>
-          <w:i/>
-          <w:color w:val="EE0000"/>
-          <w:sz w:val="20"/>
-          <w:szCs w:val="20"/>
-          <w:bdr w:val="none" w:sz="0" w:space="0" w:color="auto" w:frame="1"/>
-        </w:rPr>
-        <w:t xml:space="preserve">kthroughs). </w:t>
-      </w:r>
-    </w:p>
-    <w:p>
-      <w:pPr>
-        <w:shd w:val="clear" w:color="auto" w:fill="FFFFFF"/>
+          <w:bdr w:val="none" w:color="auto" w:sz="0" w:space="0" w:frame="1"/>
+        </w:rPr>
+        <w:t>application</w:t>
+      </w:r>
+      <w:r>
         <w:rPr>
           <w:rFonts w:ascii="Arial" w:hAnsi="Arial" w:cs="Arial"/>
           <w:color w:val="000000"/>
           <w:sz w:val="20"/>
           <w:szCs w:val="20"/>
-          <w:bdr w:val="none" w:sz="0" w:space="0" w:color="auto" w:frame="1"/>
+          <w:bdr w:val="none" w:color="auto" w:sz="0" w:space="0" w:frame="1"/>
+        </w:rPr>
+        <w:t xml:space="preserve"> making it trivial to switch from the legacy build.</w:t>
+      </w:r>
+      <w:r>
+        <w:rPr>
+          <w:rFonts w:ascii="Arial" w:hAnsi="Arial" w:cs="Arial"/>
+          <w:color w:val="000000"/>
+          <w:sz w:val="20"/>
+          <w:szCs w:val="20"/>
+          <w:bdr w:val="none" w:color="auto" w:sz="0" w:space="0" w:frame="1"/>
+        </w:rPr>
+        <w:t xml:space="preserve"> </w:t>
+      </w:r>
+      <w:r>
+        <w:rPr>
+          <w:rFonts w:ascii="Arial" w:hAnsi="Arial" w:cs="Arial"/>
+          <w:color w:val="000000"/>
+          <w:sz w:val="20"/>
+          <w:szCs w:val="20"/>
+          <w:bdr w:val="none" w:color="auto" w:sz="0" w:space="0" w:frame="1"/>
+        </w:rPr>
+        <w:t>SQLAlchemy</w:t>
+      </w:r>
+      <w:r>
+        <w:rPr>
+          <w:rFonts w:ascii="Arial" w:hAnsi="Arial" w:cs="Arial"/>
+          <w:color w:val="000000"/>
+          <w:sz w:val="20"/>
+          <w:szCs w:val="20"/>
+          <w:bdr w:val="none" w:color="auto" w:sz="0" w:space="0" w:frame="1"/>
+        </w:rPr>
+        <w:t xml:space="preserve"> will be used with flask for interacting with</w:t>
+      </w:r>
+      <w:r>
+        <w:rPr>
+          <w:rFonts w:ascii="Arial" w:hAnsi="Arial" w:cs="Arial"/>
+          <w:color w:val="000000"/>
+          <w:sz w:val="20"/>
+          <w:szCs w:val="20"/>
+          <w:bdr w:val="none" w:color="auto" w:sz="0" w:space="0" w:frame="1"/>
+        </w:rPr>
+        <w:t xml:space="preserve"> the</w:t>
+      </w:r>
+      <w:r>
+        <w:rPr>
+          <w:rFonts w:ascii="Arial" w:hAnsi="Arial" w:cs="Arial"/>
+          <w:color w:val="000000"/>
+          <w:sz w:val="20"/>
+          <w:szCs w:val="20"/>
+          <w:bdr w:val="none" w:color="auto" w:sz="0" w:space="0" w:frame="1"/>
+        </w:rPr>
+        <w:t xml:space="preserve"> </w:t>
+      </w:r>
+      <w:r>
+        <w:rPr>
+          <w:rFonts w:ascii="Arial" w:hAnsi="Arial" w:cs="Arial"/>
+          <w:color w:val="000000"/>
+          <w:sz w:val="20"/>
+          <w:szCs w:val="20"/>
+          <w:bdr w:val="none" w:color="auto" w:sz="0" w:space="0" w:frame="1"/>
+        </w:rPr>
+        <w:t>database</w:t>
+      </w:r>
+      <w:r>
+        <w:rPr>
+          <w:rFonts w:ascii="Arial" w:hAnsi="Arial" w:cs="Arial"/>
+          <w:color w:val="000000"/>
+          <w:sz w:val="20"/>
+          <w:szCs w:val="20"/>
+          <w:bdr w:val="none" w:color="auto" w:sz="0" w:space="0" w:frame="1"/>
+        </w:rPr>
+        <w:t xml:space="preserve">. </w:t>
+      </w:r>
+    </w:p>
+    <w:p>
+      <w:pPr>
+        <w:pStyle w:val="Heading1"/>
+        <w:rPr>
+          <w:rFonts w:hint="eastAsia" w:ascii="inherit" w:hAnsi="inherit" w:cs="Lucida Grande"/>
+        </w:rPr>
+      </w:pPr>
+      <w:r>
+        <w:rPr>
+          <w:bdr w:val="none" w:color="auto" w:sz="0" w:space="0" w:frame="1"/>
+        </w:rPr>
+        <w:t>Platforms, APIs, Databases, and other technologies used</w:t>
+      </w:r>
+      <w:r>
+        <w:rPr>
+          <w:bdr w:val="none" w:color="auto" w:sz="0" w:space="0" w:frame="1"/>
+        </w:rPr>
+        <w:t xml:space="preserve"> (5 points) </w:t>
+      </w:r>
+    </w:p>
+    <w:p>
+      <w:pPr>
+        <w:shd w:val="clear" w:color="auto" w:fill="FFFFFF" w:themeFill="background1"/>
+        <w:rPr>
+          <w:rFonts w:ascii="Arial" w:hAnsi="Arial" w:cs="Arial"/>
+          <w:i w:val="0"/>
+          <w:iCs w:val="0"/>
+          <w:color w:val="auto"/>
+          <w:sz w:val="20"/>
+          <w:szCs w:val="20"/>
+        </w:rPr>
+      </w:pPr>
+      <w:r>
+        <w:rPr>
+          <w:rFonts w:ascii="Arial" w:hAnsi="Arial" w:cs="Arial"/>
+          <w:i w:val="0"/>
+          <w:iCs w:val="0"/>
+          <w:color w:val="auto"/>
+          <w:sz w:val="20"/>
+          <w:szCs w:val="20"/>
+        </w:rPr>
+        <w:t>PostgresSQL</w:t>
+      </w:r>
+      <w:r>
+        <w:rPr>
+          <w:rFonts w:ascii="Arial" w:hAnsi="Arial" w:cs="Arial"/>
+          <w:i w:val="0"/>
+          <w:iCs w:val="0"/>
+          <w:color w:val="auto"/>
+          <w:sz w:val="20"/>
+          <w:szCs w:val="20"/>
+        </w:rPr>
+        <w:t xml:space="preserve"> will be used for databasing</w:t>
+      </w:r>
+      <w:r>
+        <w:rPr>
+          <w:rFonts w:ascii="Arial" w:hAnsi="Arial" w:cs="Arial"/>
+          <w:i w:val="0"/>
+          <w:iCs w:val="0"/>
+          <w:color w:val="auto"/>
+          <w:sz w:val="20"/>
+          <w:szCs w:val="20"/>
+        </w:rPr>
+        <w:t>, along with Neon</w:t>
+      </w:r>
+      <w:r>
+        <w:rPr>
+          <w:rFonts w:ascii="Arial" w:hAnsi="Arial" w:cs="Arial"/>
+          <w:i w:val="0"/>
+          <w:iCs w:val="0"/>
+          <w:color w:val="auto"/>
+          <w:sz w:val="20"/>
+          <w:szCs w:val="20"/>
+        </w:rPr>
+        <w:t xml:space="preserve"> (</w:t>
+      </w:r>
+      <w:r>
+        <w:rPr>
+          <w:rFonts w:ascii="Arial" w:hAnsi="Arial" w:cs="Arial"/>
+          <w:i w:val="0"/>
+          <w:iCs w:val="0"/>
+          <w:color w:val="auto"/>
+          <w:sz w:val="20"/>
+          <w:szCs w:val="20"/>
+        </w:rPr>
+        <w:t>uses</w:t>
+      </w:r>
+      <w:r>
+        <w:rPr>
+          <w:rFonts w:ascii="Arial" w:hAnsi="Arial" w:cs="Arial"/>
+          <w:i w:val="0"/>
+          <w:iCs w:val="0"/>
+          <w:color w:val="auto"/>
+          <w:sz w:val="20"/>
+          <w:szCs w:val="20"/>
+        </w:rPr>
+        <w:t xml:space="preserve"> AWS)</w:t>
+      </w:r>
+      <w:r>
+        <w:rPr>
+          <w:rFonts w:ascii="Arial" w:hAnsi="Arial" w:cs="Arial"/>
+          <w:i w:val="0"/>
+          <w:iCs w:val="0"/>
+          <w:color w:val="auto"/>
+          <w:sz w:val="20"/>
+          <w:szCs w:val="20"/>
+        </w:rPr>
+        <w:t xml:space="preserve"> as the database host</w:t>
+      </w:r>
+      <w:r>
+        <w:rPr>
+          <w:rFonts w:ascii="Arial" w:hAnsi="Arial" w:cs="Arial"/>
+          <w:i w:val="0"/>
+          <w:iCs w:val="0"/>
+          <w:color w:val="auto"/>
+          <w:sz w:val="20"/>
+          <w:szCs w:val="20"/>
+        </w:rPr>
+        <w:t xml:space="preserve">. </w:t>
+      </w:r>
+    </w:p>
+    <w:p>
+      <w:pPr>
+        <w:shd w:val="clear" w:color="auto" w:fill="FFFFFF" w:themeFill="background1"/>
+        <w:rPr>
+          <w:rFonts w:ascii="Arial" w:hAnsi="Arial" w:cs="Arial"/>
+          <w:i w:val="0"/>
+          <w:iCs w:val="0"/>
+          <w:color w:val="auto"/>
+          <w:sz w:val="20"/>
+          <w:szCs w:val="20"/>
+        </w:rPr>
+      </w:pPr>
+      <w:r>
+        <w:rPr>
+          <w:rFonts w:ascii="Arial" w:hAnsi="Arial" w:cs="Arial"/>
+          <w:i w:val="0"/>
+          <w:iCs w:val="0"/>
+          <w:color w:val="auto"/>
+          <w:sz w:val="20"/>
+          <w:szCs w:val="20"/>
+        </w:rPr>
+        <w:t>MTGJson and Scryfall API will be used for card information</w:t>
+      </w:r>
+      <w:r>
+        <w:rPr>
+          <w:rFonts w:ascii="Arial" w:hAnsi="Arial" w:cs="Arial"/>
+          <w:i w:val="0"/>
+          <w:iCs w:val="0"/>
+          <w:color w:val="auto"/>
+          <w:sz w:val="20"/>
+          <w:szCs w:val="20"/>
+        </w:rPr>
+        <w:t>, card images,</w:t>
+      </w:r>
+      <w:r>
+        <w:rPr>
+          <w:rFonts w:ascii="Arial" w:hAnsi="Arial" w:cs="Arial"/>
+          <w:i w:val="0"/>
+          <w:iCs w:val="0"/>
+          <w:color w:val="auto"/>
+          <w:sz w:val="20"/>
+          <w:szCs w:val="20"/>
+        </w:rPr>
+        <w:t xml:space="preserve"> and price history. </w:t>
+      </w:r>
+    </w:p>
+    <w:p>
+      <w:pPr>
+        <w:shd w:val="clear" w:color="auto" w:fill="FFFFFF" w:themeFill="background1"/>
+        <w:rPr>
+          <w:rFonts w:ascii="Arial" w:hAnsi="Arial" w:cs="Arial"/>
+          <w:i w:val="0"/>
+          <w:iCs w:val="0"/>
+          <w:color w:val="auto"/>
+          <w:sz w:val="20"/>
+          <w:szCs w:val="20"/>
+        </w:rPr>
+      </w:pPr>
+    </w:p>
+    <w:p>
+      <w:pPr>
+        <w:pStyle w:val="Heading1"/>
+        <w:rPr>
+          <w:rFonts w:ascii="inherit" w:hAnsi="inherit" w:cs="Lucida Grande"/>
+        </w:rPr>
+      </w:pPr>
+      <w:r>
+        <w:rPr>
+          <w:bdr w:val="none" w:color="auto" w:sz="0" w:space="0" w:frame="1"/>
+        </w:rPr>
+        <w:t>Execution-based Functional Testing</w:t>
+      </w:r>
+      <w:r>
+        <w:rPr>
+          <w:bdr w:val="none" w:color="auto" w:sz="0" w:space="0" w:frame="1"/>
+        </w:rPr>
+        <w:t xml:space="preserve"> (10 points)</w:t>
+      </w:r>
+    </w:p>
+    <w:p>
+      <w:pPr>
+        <w:numPr>
+          <w:ilvl w:val="0"/>
+          <w:numId w:val="0"/>
+        </w:numPr>
+        <w:shd w:val="clear" w:color="auto" w:fill="FFFFFF" w:themeFill="background1"/>
+        <w:rPr>
+          <w:rFonts w:ascii="Arial" w:hAnsi="Arial" w:cs="Arial"/>
+          <w:i w:val="0"/>
+          <w:iCs w:val="0"/>
+          <w:color w:val="auto"/>
+          <w:sz w:val="20"/>
+          <w:szCs w:val="20"/>
+        </w:rPr>
+      </w:pPr>
+      <w:r>
+        <w:rPr>
+          <w:rFonts w:ascii="Arial" w:hAnsi="Arial" w:cs="Arial"/>
+          <w:i w:val="0"/>
+          <w:iCs w:val="0"/>
+          <w:color w:val="auto"/>
+          <w:sz w:val="20"/>
+          <w:szCs w:val="20"/>
+        </w:rPr>
+        <w:t xml:space="preserve">Some functional testing was performed by running the website on </w:t>
+      </w:r>
+      <w:r>
+        <w:rPr>
+          <w:rFonts w:ascii="Arial" w:hAnsi="Arial" w:cs="Arial"/>
+          <w:i w:val="0"/>
+          <w:iCs w:val="0"/>
+          <w:color w:val="auto"/>
+          <w:sz w:val="20"/>
+          <w:szCs w:val="20"/>
+        </w:rPr>
+        <w:t>local</w:t>
+      </w:r>
+      <w:r>
+        <w:rPr>
+          <w:rFonts w:ascii="Arial" w:hAnsi="Arial" w:cs="Arial"/>
+          <w:i w:val="0"/>
+          <w:iCs w:val="0"/>
+          <w:color w:val="auto"/>
+          <w:sz w:val="20"/>
+          <w:szCs w:val="20"/>
+        </w:rPr>
+        <w:t xml:space="preserve"> machine, however the frontend and</w:t>
+      </w:r>
+      <w:r>
+        <w:rPr>
+          <w:rFonts w:ascii="Arial" w:hAnsi="Arial" w:cs="Arial"/>
+          <w:i w:val="0"/>
+          <w:iCs w:val="0"/>
+          <w:color w:val="auto"/>
+          <w:sz w:val="20"/>
+          <w:szCs w:val="20"/>
+        </w:rPr>
+        <w:t xml:space="preserve"> some of the</w:t>
+      </w:r>
+      <w:r>
+        <w:rPr>
+          <w:rFonts w:ascii="Arial" w:hAnsi="Arial" w:cs="Arial"/>
+          <w:i w:val="0"/>
+          <w:iCs w:val="0"/>
+          <w:color w:val="auto"/>
+          <w:sz w:val="20"/>
+          <w:szCs w:val="20"/>
+        </w:rPr>
+        <w:t xml:space="preserve"> backend of this </w:t>
+      </w:r>
+      <w:r>
+        <w:rPr>
+          <w:rFonts w:ascii="Arial" w:hAnsi="Arial" w:cs="Arial"/>
+          <w:i w:val="0"/>
+          <w:iCs w:val="0"/>
+          <w:color w:val="auto"/>
+          <w:sz w:val="20"/>
+          <w:szCs w:val="20"/>
+        </w:rPr>
+        <w:t>is</w:t>
+      </w:r>
+      <w:r>
+        <w:rPr>
+          <w:rFonts w:ascii="Arial" w:hAnsi="Arial" w:cs="Arial"/>
+          <w:i w:val="0"/>
+          <w:iCs w:val="0"/>
+          <w:color w:val="auto"/>
+          <w:sz w:val="20"/>
+          <w:szCs w:val="20"/>
+        </w:rPr>
+        <w:t xml:space="preserve"> going to be reworked. </w:t>
+      </w:r>
+      <w:r>
+        <w:rPr>
+          <w:rFonts w:ascii="Arial" w:hAnsi="Arial" w:cs="Arial"/>
+          <w:i w:val="0"/>
+          <w:iCs w:val="0"/>
+          <w:color w:val="auto"/>
+          <w:sz w:val="20"/>
+          <w:szCs w:val="20"/>
+        </w:rPr>
+        <w:t xml:space="preserve">Most of what is on the </w:t>
+      </w:r>
+      <w:r>
+        <w:rPr>
+          <w:rFonts w:ascii="Arial" w:hAnsi="Arial" w:cs="Arial"/>
+          <w:i w:val="0"/>
+          <w:iCs w:val="0"/>
+          <w:color w:val="auto"/>
+          <w:sz w:val="20"/>
+          <w:szCs w:val="20"/>
+        </w:rPr>
+        <w:t>Git</w:t>
+      </w:r>
+      <w:r>
+        <w:rPr>
+          <w:rFonts w:ascii="Arial" w:hAnsi="Arial" w:cs="Arial"/>
+          <w:i w:val="0"/>
+          <w:iCs w:val="0"/>
+          <w:color w:val="auto"/>
+          <w:sz w:val="20"/>
+          <w:szCs w:val="20"/>
+        </w:rPr>
+        <w:t>hub</w:t>
+      </w:r>
+      <w:r>
+        <w:rPr>
+          <w:rFonts w:ascii="Arial" w:hAnsi="Arial" w:cs="Arial"/>
+          <w:i w:val="0"/>
+          <w:iCs w:val="0"/>
+          <w:color w:val="auto"/>
+          <w:sz w:val="20"/>
+          <w:szCs w:val="20"/>
+        </w:rPr>
+        <w:t xml:space="preserve"> re</w:t>
+      </w:r>
+      <w:r>
+        <w:rPr>
+          <w:rFonts w:ascii="Arial" w:hAnsi="Arial" w:cs="Arial"/>
+          <w:i w:val="0"/>
+          <w:iCs w:val="0"/>
+          <w:color w:val="auto"/>
+          <w:sz w:val="20"/>
+          <w:szCs w:val="20"/>
+        </w:rPr>
+        <w:t xml:space="preserve">pository right now is an old project by </w:t>
+      </w:r>
+      <w:r>
+        <w:rPr>
+          <w:rFonts w:ascii="Arial" w:hAnsi="Arial" w:cs="Arial"/>
+          <w:i w:val="0"/>
+          <w:iCs w:val="0"/>
+          <w:color w:val="auto"/>
+          <w:sz w:val="20"/>
+          <w:szCs w:val="20"/>
+        </w:rPr>
+        <w:t>Rah</w:t>
+      </w:r>
+      <w:r>
+        <w:rPr>
+          <w:rFonts w:ascii="Arial" w:hAnsi="Arial" w:cs="Arial"/>
+          <w:i w:val="0"/>
+          <w:iCs w:val="0"/>
+          <w:color w:val="auto"/>
+          <w:sz w:val="20"/>
+          <w:szCs w:val="20"/>
+        </w:rPr>
+        <w:t>il Jiwani</w:t>
+      </w:r>
+      <w:r>
+        <w:rPr>
+          <w:rFonts w:ascii="Arial" w:hAnsi="Arial" w:cs="Arial"/>
+          <w:i w:val="0"/>
+          <w:iCs w:val="0"/>
+          <w:color w:val="auto"/>
+          <w:sz w:val="20"/>
+          <w:szCs w:val="20"/>
+        </w:rPr>
+        <w:t>, and</w:t>
+      </w:r>
+      <w:r>
+        <w:rPr>
+          <w:rFonts w:ascii="Arial" w:hAnsi="Arial" w:cs="Arial"/>
+          <w:i w:val="0"/>
+          <w:iCs w:val="0"/>
+          <w:color w:val="auto"/>
+          <w:sz w:val="20"/>
+          <w:szCs w:val="20"/>
+        </w:rPr>
+        <w:t xml:space="preserve"> is</w:t>
+      </w:r>
+      <w:r>
+        <w:rPr>
+          <w:rFonts w:ascii="Arial" w:hAnsi="Arial" w:cs="Arial"/>
+          <w:i w:val="0"/>
+          <w:iCs w:val="0"/>
+          <w:color w:val="auto"/>
+          <w:sz w:val="20"/>
+          <w:szCs w:val="20"/>
+        </w:rPr>
+        <w:t xml:space="preserve"> implemented with html and python</w:t>
+      </w:r>
+      <w:r>
+        <w:rPr>
+          <w:rFonts w:ascii="Arial" w:hAnsi="Arial" w:cs="Arial"/>
+          <w:i w:val="0"/>
+          <w:iCs w:val="0"/>
+          <w:color w:val="auto"/>
+          <w:sz w:val="20"/>
+          <w:szCs w:val="20"/>
+        </w:rPr>
+        <w:t xml:space="preserve">. </w:t>
+      </w:r>
+    </w:p>
+    <w:p>
+      <w:pPr>
+        <w:numPr>
+          <w:ilvl w:val="0"/>
+          <w:numId w:val="0"/>
+        </w:numPr>
+        <w:shd w:val="clear" w:color="auto" w:fill="FFFFFF" w:themeFill="background1"/>
+        <w:rPr>
+          <w:rFonts w:ascii="Arial" w:hAnsi="Arial" w:cs="Arial"/>
+          <w:i w:val="0"/>
+          <w:iCs w:val="0"/>
+          <w:color w:val="auto"/>
+          <w:sz w:val="20"/>
+          <w:szCs w:val="20"/>
+        </w:rPr>
+      </w:pPr>
+    </w:p>
+    <w:p>
+      <w:pPr>
+        <w:numPr>
+          <w:ilvl w:val="0"/>
+          <w:numId w:val="0"/>
+        </w:numPr>
+        <w:shd w:val="clear" w:color="auto" w:fill="FFFFFF" w:themeFill="background1"/>
+        <w:rPr>
+          <w:rFonts w:ascii="Arial" w:hAnsi="Arial" w:cs="Arial"/>
+          <w:i w:val="0"/>
+          <w:iCs w:val="0"/>
+          <w:color w:val="auto"/>
+          <w:sz w:val="20"/>
+          <w:szCs w:val="20"/>
+        </w:rPr>
+      </w:pPr>
+      <w:r>
+        <w:rPr>
+          <w:rFonts w:ascii="Arial" w:hAnsi="Arial" w:cs="Arial"/>
+          <w:i w:val="0"/>
+          <w:iCs w:val="0"/>
+          <w:color w:val="auto"/>
+          <w:sz w:val="20"/>
+          <w:szCs w:val="20"/>
+        </w:rPr>
+        <w:t xml:space="preserve">A Neon database has been </w:t>
+      </w:r>
+      <w:r>
+        <w:rPr>
+          <w:rFonts w:ascii="Arial" w:hAnsi="Arial" w:cs="Arial"/>
+          <w:i w:val="0"/>
+          <w:iCs w:val="0"/>
+          <w:color w:val="auto"/>
+          <w:sz w:val="20"/>
+          <w:szCs w:val="20"/>
+        </w:rPr>
+        <w:t>set-up</w:t>
+      </w:r>
+      <w:r>
+        <w:rPr>
+          <w:rFonts w:ascii="Arial" w:hAnsi="Arial" w:cs="Arial"/>
+          <w:i w:val="0"/>
+          <w:iCs w:val="0"/>
+          <w:color w:val="auto"/>
+          <w:sz w:val="20"/>
+          <w:szCs w:val="20"/>
+        </w:rPr>
+        <w:t>, with the URL being a Github Secret variable. Connecti</w:t>
+      </w:r>
+      <w:r>
+        <w:rPr>
+          <w:rFonts w:ascii="Arial" w:hAnsi="Arial" w:cs="Arial"/>
+          <w:i w:val="0"/>
+          <w:iCs w:val="0"/>
+          <w:color w:val="auto"/>
+          <w:sz w:val="20"/>
+          <w:szCs w:val="20"/>
+        </w:rPr>
+        <w:t>vity to database</w:t>
+      </w:r>
+      <w:r>
+        <w:rPr>
+          <w:rFonts w:ascii="Arial" w:hAnsi="Arial" w:cs="Arial"/>
+          <w:i w:val="0"/>
+          <w:iCs w:val="0"/>
+          <w:color w:val="auto"/>
+          <w:sz w:val="20"/>
+          <w:szCs w:val="20"/>
+        </w:rPr>
+        <w:t xml:space="preserve"> was tested on </w:t>
+      </w:r>
+      <w:r>
+        <w:rPr>
+          <w:rFonts w:ascii="Arial" w:hAnsi="Arial" w:cs="Arial"/>
+          <w:i w:val="0"/>
+          <w:iCs w:val="0"/>
+          <w:color w:val="auto"/>
+          <w:sz w:val="20"/>
+          <w:szCs w:val="20"/>
+        </w:rPr>
+        <w:t xml:space="preserve">local machine. </w:t>
+      </w:r>
+    </w:p>
+    <w:p>
+      <w:pPr>
+        <w:shd w:val="clear" w:color="auto" w:fill="FFFFFF"/>
+        <w:rPr>
+          <w:rFonts w:ascii="Arial" w:hAnsi="Arial" w:cs="Arial"/>
+          <w:color w:val="000000"/>
+          <w:sz w:val="20"/>
+          <w:szCs w:val="20"/>
+          <w:bdr w:val="none" w:color="auto" w:sz="0" w:space="0" w:frame="1"/>
         </w:rPr>
       </w:pPr>
     </w:p>
     <w:sectPr>
-      <w:pgSz w:w="12240" w:h="15840"/>
+      <w:pgSz w:w="12240" w:h="15840" w:orient="portrait"/>
       <w:pgMar w:top="1440" w:right="1800" w:bottom="1440" w:left="1800" w:header="720" w:footer="720" w:gutter="0"/>
       <w:cols w:space="720"/>
       <w:docGrid w:linePitch="360"/>
@@ -1261,7 +1462,7 @@
         <w:ind w:left="792" w:hanging="432"/>
       </w:pPr>
       <w:rPr>
-        <w:rFonts w:ascii="Arial" w:hAnsi="Arial" w:hint="default"/>
+        <w:rFonts w:hint="default" w:ascii="Arial" w:hAnsi="Arial"/>
       </w:rPr>
     </w:lvl>
     <w:lvl w:ilvl="2">
@@ -1939,7 +2140,7 @@
         <w:ind w:left="792" w:hanging="432"/>
       </w:pPr>
       <w:rPr>
-        <w:rFonts w:ascii="Arial" w:hAnsi="Arial" w:hint="default"/>
+        <w:rFonts w:hint="default" w:ascii="Arial" w:hAnsi="Arial"/>
       </w:rPr>
     </w:lvl>
     <w:lvl w:ilvl="2">
@@ -2138,7 +2339,7 @@
         <w:ind w:left="792" w:hanging="432"/>
       </w:pPr>
       <w:rPr>
-        <w:rFonts w:ascii="Arial" w:hAnsi="Arial" w:hint="default"/>
+        <w:rFonts w:hint="default" w:ascii="Arial" w:hAnsi="Arial"/>
       </w:rPr>
     </w:lvl>
     <w:lvl w:ilvl="2">
@@ -2239,7 +2440,7 @@
         <w:ind w:left="360" w:hanging="360"/>
       </w:pPr>
       <w:rPr>
-        <w:rFonts w:cstheme="majorBidi" w:hint="default"/>
+        <w:rFonts w:hint="default" w:cstheme="majorBidi"/>
         <w:color w:val="auto"/>
         <w:sz w:val="22"/>
       </w:rPr>
@@ -2253,7 +2454,7 @@
         <w:ind w:left="720" w:hanging="360"/>
       </w:pPr>
       <w:rPr>
-        <w:rFonts w:cstheme="majorBidi" w:hint="default"/>
+        <w:rFonts w:hint="default" w:cstheme="majorBidi"/>
         <w:color w:val="auto"/>
         <w:sz w:val="22"/>
       </w:rPr>
@@ -2267,7 +2468,7 @@
         <w:ind w:left="1440" w:hanging="720"/>
       </w:pPr>
       <w:rPr>
-        <w:rFonts w:cstheme="majorBidi" w:hint="default"/>
+        <w:rFonts w:hint="default" w:cstheme="majorBidi"/>
         <w:color w:val="auto"/>
         <w:sz w:val="22"/>
       </w:rPr>
@@ -2281,7 +2482,7 @@
         <w:ind w:left="1800" w:hanging="720"/>
       </w:pPr>
       <w:rPr>
-        <w:rFonts w:cstheme="majorBidi" w:hint="default"/>
+        <w:rFonts w:hint="default" w:cstheme="majorBidi"/>
         <w:color w:val="auto"/>
         <w:sz w:val="22"/>
       </w:rPr>
@@ -2295,7 +2496,7 @@
         <w:ind w:left="2520" w:hanging="1080"/>
       </w:pPr>
       <w:rPr>
-        <w:rFonts w:cstheme="majorBidi" w:hint="default"/>
+        <w:rFonts w:hint="default" w:cstheme="majorBidi"/>
         <w:color w:val="auto"/>
         <w:sz w:val="22"/>
       </w:rPr>
@@ -2309,7 +2510,7 @@
         <w:ind w:left="2880" w:hanging="1080"/>
       </w:pPr>
       <w:rPr>
-        <w:rFonts w:cstheme="majorBidi" w:hint="default"/>
+        <w:rFonts w:hint="default" w:cstheme="majorBidi"/>
         <w:color w:val="auto"/>
         <w:sz w:val="22"/>
       </w:rPr>
@@ -2323,7 +2524,7 @@
         <w:ind w:left="3600" w:hanging="1440"/>
       </w:pPr>
       <w:rPr>
-        <w:rFonts w:cstheme="majorBidi" w:hint="default"/>
+        <w:rFonts w:hint="default" w:cstheme="majorBidi"/>
         <w:color w:val="auto"/>
         <w:sz w:val="22"/>
       </w:rPr>
@@ -2337,7 +2538,7 @@
         <w:ind w:left="3960" w:hanging="1440"/>
       </w:pPr>
       <w:rPr>
-        <w:rFonts w:cstheme="majorBidi" w:hint="default"/>
+        <w:rFonts w:hint="default" w:cstheme="majorBidi"/>
         <w:color w:val="auto"/>
         <w:sz w:val="22"/>
       </w:rPr>
@@ -2351,7 +2552,7 @@
         <w:ind w:left="4680" w:hanging="1800"/>
       </w:pPr>
       <w:rPr>
-        <w:rFonts w:cstheme="majorBidi" w:hint="default"/>
+        <w:rFonts w:hint="default" w:cstheme="majorBidi"/>
         <w:color w:val="auto"/>
         <w:sz w:val="22"/>
       </w:rPr>
@@ -2370,7 +2571,7 @@
         <w:ind w:left="720" w:hanging="360"/>
       </w:pPr>
       <w:rPr>
-        <w:rFonts w:ascii="Arial" w:hAnsi="Arial" w:hint="default"/>
+        <w:rFonts w:hint="default" w:ascii="Arial" w:hAnsi="Arial"/>
       </w:rPr>
     </w:lvl>
     <w:lvl w:ilvl="1">
@@ -3434,7 +3635,7 @@
         <w:ind w:left="792" w:hanging="432"/>
       </w:pPr>
       <w:rPr>
-        <w:rFonts w:ascii="Arial" w:hAnsi="Arial" w:hint="default"/>
+        <w:rFonts w:hint="default" w:ascii="Arial" w:hAnsi="Arial"/>
       </w:rPr>
     </w:lvl>
     <w:lvl w:ilvl="2">
@@ -3875,7 +4076,7 @@
         <w:ind w:left="288" w:hanging="288"/>
       </w:pPr>
       <w:rPr>
-        <w:rFonts w:ascii="Arial" w:hAnsi="Arial" w:hint="default"/>
+        <w:rFonts w:hint="default" w:ascii="Arial" w:hAnsi="Arial"/>
       </w:rPr>
     </w:lvl>
     <w:lvl w:ilvl="1" w:tplc="04090019">
@@ -3976,7 +4177,7 @@
         <w:ind w:left="792" w:hanging="432"/>
       </w:pPr>
       <w:rPr>
-        <w:rFonts w:ascii="Arial" w:hAnsi="Arial" w:hint="default"/>
+        <w:rFonts w:hint="default" w:ascii="Arial" w:hAnsi="Arial"/>
       </w:rPr>
     </w:lvl>
     <w:lvl w:ilvl="2">
@@ -4541,7 +4742,7 @@
         <w:ind w:left="792" w:hanging="432"/>
       </w:pPr>
       <w:rPr>
-        <w:rFonts w:ascii="Arial" w:hAnsi="Arial" w:hint="default"/>
+        <w:rFonts w:hint="default" w:ascii="Arial" w:hAnsi="Arial"/>
       </w:rPr>
     </w:lvl>
     <w:lvl w:ilvl="2">
@@ -4654,7 +4855,7 @@
         <w:ind w:left="792" w:hanging="432"/>
       </w:pPr>
       <w:rPr>
-        <w:rFonts w:ascii="Arial" w:hAnsi="Arial" w:hint="default"/>
+        <w:rFonts w:hint="default" w:ascii="Arial" w:hAnsi="Arial"/>
       </w:rPr>
     </w:lvl>
     <w:lvl w:ilvl="2">
@@ -5034,7 +5235,7 @@
   <w:docDefaults>
     <w:rPrDefault>
       <w:rPr>
-        <w:rFonts w:asciiTheme="minorHAnsi" w:eastAsiaTheme="minorEastAsia" w:hAnsiTheme="minorHAnsi" w:cstheme="minorBidi"/>
+        <w:rFonts w:asciiTheme="minorHAnsi" w:hAnsiTheme="minorHAnsi" w:eastAsiaTheme="minorEastAsia" w:cstheme="minorBidi"/>
         <w:sz w:val="24"/>
         <w:szCs w:val="24"/>
         <w:lang w:val="en-US" w:eastAsia="en-US" w:bidi="ar-SA"/>
@@ -5045,14 +5246,14 @@
   <w:latentStyles w:defLockedState="0" w:defUIPriority="99" w:defSemiHidden="0" w:defUnhideWhenUsed="0" w:defQFormat="0" w:count="376">
     <w:lsdException w:name="Normal" w:uiPriority="0" w:qFormat="1"/>
     <w:lsdException w:name="heading 1" w:uiPriority="9" w:qFormat="1"/>
-    <w:lsdException w:name="heading 2" w:semiHidden="1" w:uiPriority="9" w:unhideWhenUsed="1" w:qFormat="1"/>
-    <w:lsdException w:name="heading 3" w:semiHidden="1" w:uiPriority="9" w:unhideWhenUsed="1" w:qFormat="1"/>
-    <w:lsdException w:name="heading 4" w:semiHidden="1" w:uiPriority="9" w:unhideWhenUsed="1" w:qFormat="1"/>
-    <w:lsdException w:name="heading 5" w:semiHidden="1" w:uiPriority="9" w:unhideWhenUsed="1" w:qFormat="1"/>
-    <w:lsdException w:name="heading 6" w:semiHidden="1" w:uiPriority="9" w:unhideWhenUsed="1" w:qFormat="1"/>
-    <w:lsdException w:name="heading 7" w:semiHidden="1" w:uiPriority="9" w:unhideWhenUsed="1" w:qFormat="1"/>
-    <w:lsdException w:name="heading 8" w:semiHidden="1" w:uiPriority="9" w:unhideWhenUsed="1" w:qFormat="1"/>
-    <w:lsdException w:name="heading 9" w:semiHidden="1" w:uiPriority="9" w:unhideWhenUsed="1" w:qFormat="1"/>
+    <w:lsdException w:name="heading 2" w:uiPriority="9" w:semiHidden="1" w:unhideWhenUsed="1" w:qFormat="1"/>
+    <w:lsdException w:name="heading 3" w:uiPriority="9" w:semiHidden="1" w:unhideWhenUsed="1" w:qFormat="1"/>
+    <w:lsdException w:name="heading 4" w:uiPriority="9" w:semiHidden="1" w:unhideWhenUsed="1" w:qFormat="1"/>
+    <w:lsdException w:name="heading 5" w:uiPriority="9" w:semiHidden="1" w:unhideWhenUsed="1" w:qFormat="1"/>
+    <w:lsdException w:name="heading 6" w:uiPriority="9" w:semiHidden="1" w:unhideWhenUsed="1" w:qFormat="1"/>
+    <w:lsdException w:name="heading 7" w:uiPriority="9" w:semiHidden="1" w:unhideWhenUsed="1" w:qFormat="1"/>
+    <w:lsdException w:name="heading 8" w:uiPriority="9" w:semiHidden="1" w:unhideWhenUsed="1" w:qFormat="1"/>
+    <w:lsdException w:name="heading 9" w:uiPriority="9" w:semiHidden="1" w:unhideWhenUsed="1" w:qFormat="1"/>
     <w:lsdException w:name="index 1" w:semiHidden="1" w:unhideWhenUsed="1"/>
     <w:lsdException w:name="index 2" w:semiHidden="1" w:unhideWhenUsed="1"/>
     <w:lsdException w:name="index 3" w:semiHidden="1" w:unhideWhenUsed="1"/>
@@ -5062,22 +5263,22 @@
     <w:lsdException w:name="index 7" w:semiHidden="1" w:unhideWhenUsed="1"/>
     <w:lsdException w:name="index 8" w:semiHidden="1" w:unhideWhenUsed="1"/>
     <w:lsdException w:name="index 9" w:semiHidden="1" w:unhideWhenUsed="1"/>
-    <w:lsdException w:name="toc 1" w:semiHidden="1" w:uiPriority="39" w:unhideWhenUsed="1"/>
-    <w:lsdException w:name="toc 2" w:semiHidden="1" w:uiPriority="39" w:unhideWhenUsed="1"/>
-    <w:lsdException w:name="toc 3" w:semiHidden="1" w:uiPriority="39" w:unhideWhenUsed="1"/>
-    <w:lsdException w:name="toc 4" w:semiHidden="1" w:uiPriority="39" w:unhideWhenUsed="1"/>
-    <w:lsdException w:name="toc 5" w:semiHidden="1" w:uiPriority="39" w:unhideWhenUsed="1"/>
-    <w:lsdException w:name="toc 6" w:semiHidden="1" w:uiPriority="39" w:unhideWhenUsed="1"/>
-    <w:lsdException w:name="toc 7" w:semiHidden="1" w:uiPriority="39" w:unhideWhenUsed="1"/>
-    <w:lsdException w:name="toc 8" w:semiHidden="1" w:uiPriority="39" w:unhideWhenUsed="1"/>
-    <w:lsdException w:name="toc 9" w:semiHidden="1" w:uiPriority="39" w:unhideWhenUsed="1"/>
+    <w:lsdException w:name="toc 1" w:uiPriority="39" w:semiHidden="1" w:unhideWhenUsed="1"/>
+    <w:lsdException w:name="toc 2" w:uiPriority="39" w:semiHidden="1" w:unhideWhenUsed="1"/>
+    <w:lsdException w:name="toc 3" w:uiPriority="39" w:semiHidden="1" w:unhideWhenUsed="1"/>
+    <w:lsdException w:name="toc 4" w:uiPriority="39" w:semiHidden="1" w:unhideWhenUsed="1"/>
+    <w:lsdException w:name="toc 5" w:uiPriority="39" w:semiHidden="1" w:unhideWhenUsed="1"/>
+    <w:lsdException w:name="toc 6" w:uiPriority="39" w:semiHidden="1" w:unhideWhenUsed="1"/>
+    <w:lsdException w:name="toc 7" w:uiPriority="39" w:semiHidden="1" w:unhideWhenUsed="1"/>
+    <w:lsdException w:name="toc 8" w:uiPriority="39" w:semiHidden="1" w:unhideWhenUsed="1"/>
+    <w:lsdException w:name="toc 9" w:uiPriority="39" w:semiHidden="1" w:unhideWhenUsed="1"/>
     <w:lsdException w:name="Normal Indent" w:semiHidden="1" w:unhideWhenUsed="1"/>
     <w:lsdException w:name="footnote text" w:semiHidden="1" w:unhideWhenUsed="1"/>
     <w:lsdException w:name="annotation text" w:semiHidden="1" w:unhideWhenUsed="1"/>
     <w:lsdException w:name="header" w:semiHidden="1" w:unhideWhenUsed="1"/>
     <w:lsdException w:name="footer" w:semiHidden="1" w:unhideWhenUsed="1"/>
     <w:lsdException w:name="index heading" w:semiHidden="1" w:unhideWhenUsed="1"/>
-    <w:lsdException w:name="caption" w:semiHidden="1" w:uiPriority="35" w:unhideWhenUsed="1" w:qFormat="1"/>
+    <w:lsdException w:name="caption" w:uiPriority="35" w:semiHidden="1" w:unhideWhenUsed="1" w:qFormat="1"/>
     <w:lsdException w:name="table of figures" w:semiHidden="1" w:unhideWhenUsed="1"/>
     <w:lsdException w:name="envelope address" w:semiHidden="1" w:unhideWhenUsed="1"/>
     <w:lsdException w:name="envelope return" w:semiHidden="1" w:unhideWhenUsed="1"/>
@@ -5108,8 +5309,8 @@
     <w:lsdException w:name="Title" w:uiPriority="10" w:qFormat="1"/>
     <w:lsdException w:name="Closing" w:semiHidden="1" w:unhideWhenUsed="1"/>
     <w:lsdException w:name="Signature" w:semiHidden="1" w:unhideWhenUsed="1"/>
-    <w:lsdException w:name="Default Paragraph Font" w:semiHidden="1" w:uiPriority="1" w:unhideWhenUsed="1"/>
-    <w:lsdException w:name="Body Text" w:semiHidden="1" w:uiPriority="0" w:unhideWhenUsed="1"/>
+    <w:lsdException w:name="Default Paragraph Font" w:uiPriority="1" w:semiHidden="1" w:unhideWhenUsed="1"/>
+    <w:lsdException w:name="Body Text" w:uiPriority="0" w:semiHidden="1" w:unhideWhenUsed="1"/>
     <w:lsdException w:name="Body Text Indent" w:semiHidden="1" w:unhideWhenUsed="1"/>
     <w:lsdException w:name="List Continue" w:semiHidden="1" w:unhideWhenUsed="1"/>
     <w:lsdException w:name="List Continue 2" w:semiHidden="1" w:unhideWhenUsed="1"/>
@@ -5308,8 +5509,8 @@
     <w:lsdException w:name="Subtle Reference" w:uiPriority="31" w:qFormat="1"/>
     <w:lsdException w:name="Intense Reference" w:uiPriority="32" w:qFormat="1"/>
     <w:lsdException w:name="Book Title" w:uiPriority="33" w:qFormat="1"/>
-    <w:lsdException w:name="Bibliography" w:semiHidden="1" w:uiPriority="37" w:unhideWhenUsed="1"/>
-    <w:lsdException w:name="TOC Heading" w:semiHidden="1" w:uiPriority="39" w:unhideWhenUsed="1" w:qFormat="1"/>
+    <w:lsdException w:name="Bibliography" w:uiPriority="37" w:semiHidden="1" w:unhideWhenUsed="1"/>
+    <w:lsdException w:name="TOC Heading" w:uiPriority="39" w:semiHidden="1" w:unhideWhenUsed="1" w:qFormat="1"/>
     <w:lsdException w:name="Grid Table 4" w:uiPriority="49"/>
     <w:lsdException w:name="Grid Table 5 Dark" w:uiPriority="50"/>
     <w:lsdException w:name="Grid Table 6 Colorful" w:uiPriority="51"/>
@@ -5411,7 +5612,7 @@
     <w:lsdException w:name="Unresolved Mention" w:semiHidden="1" w:unhideWhenUsed="1"/>
     <w:lsdException w:name="Smart Link" w:semiHidden="1" w:unhideWhenUsed="1"/>
   </w:latentStyles>
-  <w:style w:type="paragraph" w:default="1" w:styleId="Normal">
+  <w:style w:type="paragraph" w:styleId="Normal" w:default="1">
     <w:name w:val="Normal"/>
     <w:qFormat/>
   </w:style>
@@ -5433,7 +5634,7 @@
       <w:outlineLvl w:val="0"/>
     </w:pPr>
     <w:rPr>
-      <w:rFonts w:ascii="Arial" w:eastAsiaTheme="majorEastAsia" w:hAnsi="Arial" w:cstheme="majorBidi"/>
+      <w:rFonts w:ascii="Arial" w:hAnsi="Arial" w:eastAsiaTheme="majorEastAsia" w:cstheme="majorBidi"/>
       <w:b/>
       <w:bCs/>
       <w:szCs w:val="32"/>
@@ -5457,21 +5658,21 @@
       <w:outlineLvl w:val="1"/>
     </w:pPr>
     <w:rPr>
-      <w:rFonts w:ascii="Arial" w:eastAsiaTheme="majorEastAsia" w:hAnsi="Arial" w:cstheme="majorBidi"/>
+      <w:rFonts w:ascii="Arial" w:hAnsi="Arial" w:eastAsiaTheme="majorEastAsia" w:cstheme="majorBidi"/>
       <w:b/>
       <w:bCs/>
       <w:sz w:val="22"/>
       <w:szCs w:val="26"/>
-      <w:bdr w:val="none" w:sz="0" w:space="0" w:color="auto" w:frame="1"/>
+      <w:bdr w:val="none" w:color="auto" w:sz="0" w:space="0" w:frame="1"/>
     </w:rPr>
   </w:style>
-  <w:style w:type="character" w:default="1" w:styleId="DefaultParagraphFont">
+  <w:style w:type="character" w:styleId="DefaultParagraphFont" w:default="1">
     <w:name w:val="Default Paragraph Font"/>
     <w:uiPriority w:val="1"/>
     <w:semiHidden/>
     <w:unhideWhenUsed/>
   </w:style>
-  <w:style w:type="table" w:default="1" w:styleId="TableNormal">
+  <w:style w:type="table" w:styleId="TableNormal" w:default="1">
     <w:name w:val="Normal Table"/>
     <w:uiPriority w:val="99"/>
     <w:semiHidden/>
@@ -5486,7 +5687,7 @@
       </w:tblCellMar>
     </w:tblPr>
   </w:style>
-  <w:style w:type="numbering" w:default="1" w:styleId="NoList">
+  <w:style w:type="numbering" w:styleId="NoList" w:default="1">
     <w:name w:val="No List"/>
     <w:uiPriority w:val="99"/>
     <w:semiHidden/>
@@ -5506,19 +5707,19 @@
       <w:jc w:val="both"/>
     </w:pPr>
     <w:rPr>
-      <w:rFonts w:ascii="Times New Roman" w:eastAsia="SimSun" w:hAnsi="Times New Roman" w:cs="Times New Roman"/>
+      <w:rFonts w:ascii="Times New Roman" w:hAnsi="Times New Roman" w:eastAsia="SimSun" w:cs="Times New Roman"/>
       <w:spacing w:val="-1"/>
       <w:sz w:val="20"/>
       <w:szCs w:val="20"/>
       <w:lang w:val="x-none" w:eastAsia="x-none"/>
     </w:rPr>
   </w:style>
-  <w:style w:type="character" w:customStyle="1" w:styleId="BodyTextChar">
+  <w:style w:type="character" w:styleId="BodyTextChar" w:customStyle="1">
     <w:name w:val="Body Text Char"/>
     <w:link w:val="BodyText"/>
     <w:rsid w:val="00307323"/>
     <w:rPr>
-      <w:rFonts w:ascii="Times New Roman" w:eastAsia="SimSun" w:hAnsi="Times New Roman" w:cs="Times New Roman"/>
+      <w:rFonts w:ascii="Times New Roman" w:hAnsi="Times New Roman" w:eastAsia="SimSun" w:cs="Times New Roman"/>
       <w:spacing w:val="-1"/>
       <w:sz w:val="20"/>
       <w:szCs w:val="20"/>
@@ -5552,37 +5753,37 @@
       <w:szCs w:val="20"/>
     </w:rPr>
   </w:style>
-  <w:style w:type="character" w:customStyle="1" w:styleId="spelle">
+  <w:style w:type="character" w:styleId="spelle" w:customStyle="1">
     <w:name w:val="spelle"/>
     <w:basedOn w:val="DefaultParagraphFont"/>
     <w:rsid w:val="00C61132"/>
   </w:style>
-  <w:style w:type="character" w:customStyle="1" w:styleId="Heading1Char">
+  <w:style w:type="character" w:styleId="Heading1Char" w:customStyle="1">
     <w:name w:val="Heading 1 Char"/>
     <w:basedOn w:val="DefaultParagraphFont"/>
     <w:link w:val="Heading1"/>
     <w:uiPriority w:val="9"/>
     <w:rsid w:val="0047792C"/>
     <w:rPr>
-      <w:rFonts w:ascii="Arial" w:eastAsiaTheme="majorEastAsia" w:hAnsi="Arial" w:cstheme="majorBidi"/>
+      <w:rFonts w:ascii="Arial" w:hAnsi="Arial" w:eastAsiaTheme="majorEastAsia" w:cstheme="majorBidi"/>
       <w:b/>
       <w:bCs/>
       <w:szCs w:val="32"/>
     </w:rPr>
   </w:style>
-  <w:style w:type="character" w:customStyle="1" w:styleId="Heading2Char">
+  <w:style w:type="character" w:styleId="Heading2Char" w:customStyle="1">
     <w:name w:val="Heading 2 Char"/>
     <w:basedOn w:val="DefaultParagraphFont"/>
     <w:link w:val="Heading2"/>
     <w:uiPriority w:val="9"/>
     <w:rsid w:val="00431C09"/>
     <w:rPr>
-      <w:rFonts w:ascii="Arial" w:eastAsiaTheme="majorEastAsia" w:hAnsi="Arial" w:cstheme="majorBidi"/>
+      <w:rFonts w:ascii="Arial" w:hAnsi="Arial" w:eastAsiaTheme="majorEastAsia" w:cstheme="majorBidi"/>
       <w:b/>
       <w:bCs/>
       <w:sz w:val="22"/>
       <w:szCs w:val="26"/>
-      <w:bdr w:val="none" w:sz="0" w:space="0" w:color="auto" w:frame="1"/>
+      <w:bdr w:val="none" w:color="auto" w:sz="0" w:space="0" w:frame="1"/>
     </w:rPr>
   </w:style>
   <w:style w:type="paragraph" w:styleId="ListParagraph">

</xml_diff>